<commit_message>
docs(video-script): update video script and DOCX submission pack with prominent AI Chatbot showcase
</commit_message>
<xml_diff>
--- a/docs/handoff/04-Video-Script-Submission.docx
+++ b/docs/handoff/04-Video-Script-Submission.docx
@@ -414,19 +414,8 @@
             </w:tcMar>
           </w:tcPr>
           <w:p>
-            <w:pPr>
-              <w:spacing w:line="276"/>
-            </w:pPr>
-            <w:r>
-              <w:rPr>
-                <w:rFonts w:ascii="Calibri" w:eastAsia="Microsoft YaHei"/>
-                <w:b/>
-                <w:bCs/>
-                <w:color w:val="FFFFFF"/>
-                <w:sz w:val="20"/>
-                <w:szCs w:val="20"/>
-              </w:rPr>
-              <w:t xml:space="preserve">Time</w:t>
+            <w:r>
+              <w:t>Time</w:t>
             </w:r>
           </w:p>
         </w:tc>
@@ -442,19 +431,8 @@
             </w:tcMar>
           </w:tcPr>
           <w:p>
-            <w:pPr>
-              <w:spacing w:line="276"/>
-            </w:pPr>
-            <w:r>
-              <w:rPr>
-                <w:rFonts w:ascii="Calibri" w:eastAsia="Microsoft YaHei"/>
-                <w:b/>
-                <w:bCs/>
-                <w:color w:val="FFFFFF"/>
-                <w:sz w:val="20"/>
-                <w:szCs w:val="20"/>
-              </w:rPr>
-              <w:t xml:space="preserve">What you click / show</w:t>
+            <w:r>
+              <w:t>What you click / show</w:t>
             </w:r>
           </w:p>
         </w:tc>
@@ -470,19 +448,8 @@
             </w:tcMar>
           </w:tcPr>
           <w:p>
-            <w:pPr>
-              <w:spacing w:line="276"/>
-            </w:pPr>
-            <w:r>
-              <w:rPr>
-                <w:rFonts w:ascii="Calibri" w:eastAsia="Microsoft YaHei"/>
-                <w:b/>
-                <w:bCs/>
-                <w:color w:val="FFFFFF"/>
-                <w:sz w:val="20"/>
-                <w:szCs w:val="20"/>
-              </w:rPr>
-              <w:t xml:space="preserve">What you say (read as written)</w:t>
+            <w:r>
+              <w:t>What you say (read as written)</w:t>
             </w:r>
           </w:p>
         </w:tc>
@@ -502,17 +469,8 @@
             </w:tcMar>
           </w:tcPr>
           <w:p>
-            <w:pPr>
-              <w:spacing w:line="276"/>
-            </w:pPr>
-            <w:r>
-              <w:rPr>
-                <w:rFonts w:ascii="Calibri" w:eastAsia="Microsoft YaHei"/>
-                <w:color w:val="182030"/>
-                <w:sz w:val="20"/>
-                <w:szCs w:val="20"/>
-              </w:rPr>
-              <w:t xml:space="preserve">0:00-0:10</w:t>
+            <w:r>
+              <w:t>0:00-0:15</w:t>
             </w:r>
           </w:p>
         </w:tc>
@@ -527,17 +485,8 @@
             </w:tcMar>
           </w:tcPr>
           <w:p>
-            <w:pPr>
-              <w:spacing w:line="276"/>
-            </w:pPr>
-            <w:r>
-              <w:rPr>
-                <w:rFonts w:ascii="Calibri" w:eastAsia="Microsoft YaHei"/>
-                <w:color w:val="182030"/>
-                <w:sz w:val="20"/>
-                <w:szCs w:val="20"/>
-              </w:rPr>
-              <w:t xml:space="preserve">Slide with big text: Customers leave quietly.</w:t>
+            <w:r>
+              <w:t>Live Dashboard. Welcome Strip visible at top. Move mouse to Acme Corp: falling sparkline, delta -16%, pulsing red NEEDS ATTENTION badge.</w:t>
             </w:r>
           </w:p>
         </w:tc>
@@ -552,17 +501,8 @@
             </w:tcMar>
           </w:tcPr>
           <w:p>
-            <w:pPr>
-              <w:spacing w:line="276"/>
-            </w:pPr>
-            <w:r>
-              <w:rPr>
-                <w:rFonts w:ascii="Calibri" w:eastAsia="Microsoft YaHei"/>
-                <w:color w:val="182030"/>
-                <w:sz w:val="20"/>
-                <w:szCs w:val="20"/>
-              </w:rPr>
-              <w:t xml:space="preserve">Customers leave quietly. They stop using your product weeks before they cancel. PulseGuard notices - and acts, end to end.</w:t>
+            <w:r>
+              <w:t>Customers rarely cancel out of nowhere — usage fades weeks earlier. This is PulseGuard — an autonomous customer retention engine built on Fastn. Watch Acme Corp: weekly usage dropped sixteen percent, crossing our risk threshold.</w:t>
             </w:r>
           </w:p>
         </w:tc>
@@ -582,17 +522,8 @@
             </w:tcMar>
           </w:tcPr>
           <w:p>
-            <w:pPr>
-              <w:spacing w:line="276"/>
-            </w:pPr>
-            <w:r>
-              <w:rPr>
-                <w:rFonts w:ascii="Calibri" w:eastAsia="Microsoft YaHei"/>
-                <w:color w:val="182030"/>
-                <w:sz w:val="20"/>
-                <w:szCs w:val="20"/>
-              </w:rPr>
-              <w:t xml:space="preserve">0:10-0:30</w:t>
+            <w:r>
+              <w:t>0:15-0:35</w:t>
             </w:r>
           </w:p>
         </w:tc>
@@ -607,17 +538,8 @@
             </w:tcMar>
           </w:tcPr>
           <w:p>
-            <w:pPr>
-              <w:spacing w:line="276"/>
-            </w:pPr>
-            <w:r>
-              <w:rPr>
-                <w:rFonts w:ascii="Calibri" w:eastAsia="Microsoft YaHei"/>
-                <w:color w:val="182030"/>
-                <w:sz w:val="20"/>
-                <w:szCs w:val="20"/>
-              </w:rPr>
-              <w:t xml:space="preserve">Dashboard. Slowly move the mouse over the red row (Acme Corp).</w:t>
+            <w:r>
+              <w:t>Click Sync Telemetry (next to Autonomous Watch). Watch row narrate live: Ingesting… -&gt; Evaluating… -&gt; Syncing CRM… -&gt; Telemetry synced. Cut briefly to Slack #pulseguard-alpha card and HubSpot timeline note.</w:t>
             </w:r>
           </w:p>
         </w:tc>
@@ -632,17 +554,8 @@
             </w:tcMar>
           </w:tcPr>
           <w:p>
-            <w:pPr>
-              <w:spacing w:line="276"/>
-            </w:pPr>
-            <w:r>
-              <w:rPr>
-                <w:rFonts w:ascii="Calibri" w:eastAsia="Microsoft YaHei"/>
-                <w:color w:val="182030"/>
-                <w:sz w:val="20"/>
-                <w:szCs w:val="20"/>
-              </w:rPr>
-              <w:t xml:space="preserve">This is PulseGuard. It watches how customers use your software. See this red row? This customer is using it sixteen percent less this week. That is a warning sign.</w:t>
+            <w:r>
+              <w:t>I click Sync Telemetry. In real-time, Fastn ingests customer telemetry, evaluates the threshold, writes a diagnosis to HubSpot CRM, and alerts the right Slack channel and email — in seconds, per tenant.</w:t>
             </w:r>
           </w:p>
         </w:tc>
@@ -662,17 +575,8 @@
             </w:tcMar>
           </w:tcPr>
           <w:p>
-            <w:pPr>
-              <w:spacing w:line="276"/>
-            </w:pPr>
-            <w:r>
-              <w:rPr>
-                <w:rFonts w:ascii="Calibri" w:eastAsia="Microsoft YaHei"/>
-                <w:color w:val="182030"/>
-                <w:sz w:val="20"/>
-                <w:szCs w:val="20"/>
-              </w:rPr>
-              <w:t xml:space="preserve">0:30-0:55</w:t>
+            <w:r>
+              <w:t>0:35-0:50</w:t>
             </w:r>
           </w:p>
         </w:tc>
@@ -687,17 +591,8 @@
             </w:tcMar>
           </w:tcPr>
           <w:p>
-            <w:pPr>
-              <w:spacing w:line="276"/>
-            </w:pPr>
-            <w:r>
-              <w:rPr>
-                <w:rFonts w:ascii="Calibri" w:eastAsia="Microsoft YaHei"/>
-                <w:color w:val="182030"/>
-                <w:sz w:val="20"/>
-                <w:szCs w:val="20"/>
-              </w:rPr>
-              <w:t xml:space="preserve">Press Simulate Anomaly. Show the row telling you each step. Then switch to the Slack window and show the card that arrived.</w:t>
+            <w:r>
+              <w:t>Sidebar: click Emails (/emails). Show full-width log. Click top email to open the Email Reader Modal. Highlight the live Sent -&gt; Delivered stepper and rendered alert card.</w:t>
             </w:r>
           </w:p>
         </w:tc>
@@ -712,17 +607,8 @@
             </w:tcMar>
           </w:tcPr>
           <w:p>
-            <w:pPr>
-              <w:spacing w:line="276"/>
-            </w:pPr>
-            <w:r>
-              <w:rPr>
-                <w:rFonts w:ascii="Calibri" w:eastAsia="Microsoft YaHei"/>
-                <w:color w:val="182030"/>
-                <w:sz w:val="20"/>
-                <w:szCs w:val="20"/>
-              </w:rPr>
-              <w:t xml:space="preserve">I press one button. PulseGuard checks the account, writes a note in the CRM, and sends a message to the team on Slack - all by itself, in seconds.</w:t>
+            <w:r>
+              <w:t>On our Emails page, Fastn Google Gmail connector confirmed delivery with a live delivery stepper. The email gives the account manager full signal trace and an acknowledgment link.</w:t>
             </w:r>
           </w:p>
         </w:tc>
@@ -742,17 +628,8 @@
             </w:tcMar>
           </w:tcPr>
           <w:p>
-            <w:pPr>
-              <w:spacing w:line="276"/>
-            </w:pPr>
-            <w:r>
-              <w:rPr>
-                <w:rFonts w:ascii="Calibri" w:eastAsia="Microsoft YaHei"/>
-                <w:color w:val="182030"/>
-                <w:sz w:val="20"/>
-                <w:szCs w:val="20"/>
-              </w:rPr>
-              <w:t xml:space="preserve">0:55-1:10</w:t>
+            <w:r>
+              <w:t>0:50-1:25</w:t>
             </w:r>
           </w:p>
         </w:tc>
@@ -767,17 +644,8 @@
             </w:tcMar>
           </w:tcPr>
           <w:p>
-            <w:pPr>
-              <w:spacing w:line="276"/>
-            </w:pPr>
-            <w:r>
-              <w:rPr>
-                <w:rFonts w:ascii="Calibri" w:eastAsia="Microsoft YaHei"/>
-                <w:color w:val="182030"/>
-                <w:sz w:val="20"/>
-                <w:szCs w:val="20"/>
-              </w:rPr>
-              <w:t xml:space="preserve">HubSpot window. Scroll to the new note on Acme's page.</w:t>
+            <w:r>
+              <w:t>THE CHATBOT (CENTERPIECE): Click bottom-right AI Assistant pill. Dock slides open Cursor-style. Click Which account needs attention? -&gt; Chatbot analyzes live accounts. Then click Acknowledge the Acme Corp risk -&gt; Chatbot renders interactive Tool Call Card (acknowledge-risk). Click Approve -&gt; Tool executes! Background row flashes, badge flips to HANDLED, KPI drops from 1 to 0! Ask What just happened? -&gt; Chatbot recaps.</w:t>
             </w:r>
           </w:p>
         </w:tc>
@@ -792,17 +660,8 @@
             </w:tcMar>
           </w:tcPr>
           <w:p>
-            <w:pPr>
-              <w:spacing w:line="276"/>
-            </w:pPr>
-            <w:r>
-              <w:rPr>
-                <w:rFonts w:ascii="Calibri" w:eastAsia="Microsoft YaHei"/>
-                <w:color w:val="182030"/>
-                <w:sz w:val="20"/>
-                <w:szCs w:val="20"/>
-              </w:rPr>
-              <w:t xml:space="preserve">Here is the note - right on the customer's page in the CRM. Nobody wrote it. The system did.</w:t>
+            <w:r>
+              <w:t>And here is the centerpiece: our built-in AI chatbot. The assistant reads live telemetry, explains risk in plain English, and prioritizes outreach. Even better, I tell the chatbot to acknowledge the risk directly from chat. That triggers a real Fastn workflow: the tool card executes, the CRM updates, the dashboard flips to Handled, and the KPI drops to zero — a complete autonomous closed loop.</w:t>
             </w:r>
           </w:p>
         </w:tc>
@@ -822,17 +681,8 @@
             </w:tcMar>
           </w:tcPr>
           <w:p>
-            <w:pPr>
-              <w:spacing w:line="276"/>
-            </w:pPr>
-            <w:r>
-              <w:rPr>
-                <w:rFonts w:ascii="Calibri" w:eastAsia="Microsoft YaHei"/>
-                <w:color w:val="182030"/>
-                <w:sz w:val="20"/>
-                <w:szCs w:val="20"/>
-              </w:rPr>
-              <w:t xml:space="preserve">1:10-1:40</w:t>
+            <w:r>
+              <w:t>1:25-1:45</w:t>
             </w:r>
           </w:p>
         </w:tc>
@@ -847,17 +697,8 @@
             </w:tcMar>
           </w:tcPr>
           <w:p>
-            <w:pPr>
-              <w:spacing w:line="276"/>
-            </w:pPr>
-            <w:r>
-              <w:rPr>
-                <w:rFonts w:ascii="Calibri" w:eastAsia="Microsoft YaHei"/>
-                <w:color w:val="182030"/>
-                <w:sz w:val="20"/>
-                <w:szCs w:val="20"/>
-              </w:rPr>
-              <w:t xml:space="preserve">Back to the dashboard. Open the chat (bottom-right). Click Which account needs attention? - let it answer. Then click Acknowledge the Acme Corp risk. Show the row turn green and the number go to zero.</w:t>
+            <w:r>
+              <w:t>Sidebar switcher: change to Tenant Beta (Globex Exports). Show isolated data (.5K ARR, #pulseguard-beta). Click Integrations: show 8-connector MCP catalog with glowing green/red link buttons. Click Slack to trigger green test ping toast.</w:t>
             </w:r>
           </w:p>
         </w:tc>
@@ -872,17 +713,8 @@
             </w:tcMar>
           </w:tcPr>
           <w:p>
-            <w:pPr>
-              <w:spacing w:line="276"/>
-            </w:pPr>
-            <w:r>
-              <w:rPr>
-                <w:rFonts w:ascii="Calibri" w:eastAsia="Microsoft YaHei"/>
-                <w:color w:val="182030"/>
-                <w:sz w:val="20"/>
-                <w:szCs w:val="20"/>
-              </w:rPr>
-              <w:t xml:space="preserve">Now the best part. I ask the helper: which customer should I call first? It answers with real numbers. Now I tell it: handle Acme Corp. It did the work for me - the CRM is updated, the warning is gone. All real. All automatic.</w:t>
+            <w:r>
+              <w:t>Every customer lives in an isolated workspace — own CRM, own Slack channel, zero data leakage. On our Integrations page, Fastn 8-connector MCP catalog manages live connections with instant diagnostic pings and full tenant isolation.</w:t>
             </w:r>
           </w:p>
         </w:tc>
@@ -902,17 +734,8 @@
             </w:tcMar>
           </w:tcPr>
           <w:p>
-            <w:pPr>
-              <w:spacing w:line="276"/>
-            </w:pPr>
-            <w:r>
-              <w:rPr>
-                <w:rFonts w:ascii="Calibri" w:eastAsia="Microsoft YaHei"/>
-                <w:color w:val="182030"/>
-                <w:sz w:val="20"/>
-                <w:szCs w:val="20"/>
-              </w:rPr>
-              <w:t xml:space="preserve">1:40-1:50</w:t>
+            <w:r>
+              <w:t>1:45-2:00</w:t>
             </w:r>
           </w:p>
         </w:tc>
@@ -927,17 +750,8 @@
             </w:tcMar>
           </w:tcPr>
           <w:p>
-            <w:pPr>
-              <w:spacing w:line="276"/>
-            </w:pPr>
-            <w:r>
-              <w:rPr>
-                <w:rFonts w:ascii="Calibri" w:eastAsia="Microsoft YaHei"/>
-                <w:color w:val="182030"/>
-                <w:sz w:val="20"/>
-                <w:szCs w:val="20"/>
-              </w:rPr>
-              <w:t xml:space="preserve">Use the sidebar switcher: change to Tenant Beta. Show the different data. Quick flash of the Integrations page.</w:t>
+            <w:r>
+              <w:t>Click Activity (/runs). Show live trace (ack-by-pulseguard-assistant -&gt; crm-note-appended -&gt; risk-badge-cleared). Expand Platform details to reveal Fastn Org ID and workflow IDs.</w:t>
             </w:r>
           </w:p>
         </w:tc>
@@ -952,97 +766,8 @@
             </w:tcMar>
           </w:tcPr>
           <w:p>
-            <w:pPr>
-              <w:spacing w:line="276"/>
-            </w:pPr>
-            <w:r>
-              <w:rPr>
-                <w:rFonts w:ascii="Calibri" w:eastAsia="Microsoft YaHei"/>
-                <w:color w:val="182030"/>
-                <w:sz w:val="20"/>
-                <w:szCs w:val="20"/>
-              </w:rPr>
-              <w:t xml:space="preserve">Every customer gets their own private space - their own CRM, their own Slack channel. They never mix.</w:t>
-            </w:r>
-          </w:p>
-        </w:tc>
-      </w:tr>
-      <w:tr>
-        <w:trPr>
-          <w:cantSplit/>
-        </w:trPr>
-        <w:tc>
-          <w:tcPr>
-            <w:tcW w:type="pct" w:w="12%"/>
-            <w:tcMar>
-              <w:top w:type="dxa" w:w="60"/>
-              <w:left w:type="dxa" w:w="120"/>
-              <w:bottom w:type="dxa" w:w="60"/>
-              <w:right w:type="dxa" w:w="120"/>
-            </w:tcMar>
-          </w:tcPr>
-          <w:p>
-            <w:pPr>
-              <w:spacing w:line="276"/>
-            </w:pPr>
-            <w:r>
-              <w:rPr>
-                <w:rFonts w:ascii="Calibri" w:eastAsia="Microsoft YaHei"/>
-                <w:color w:val="182030"/>
-                <w:sz w:val="20"/>
-                <w:szCs w:val="20"/>
-              </w:rPr>
-              <w:t xml:space="preserve">1:50-2:00</w:t>
-            </w:r>
-          </w:p>
-        </w:tc>
-        <w:tc>
-          <w:tcPr>
-            <w:tcW w:type="pct" w:w="34%"/>
-            <w:tcMar>
-              <w:top w:type="dxa" w:w="60"/>
-              <w:left w:type="dxa" w:w="120"/>
-              <w:bottom w:type="dxa" w:w="60"/>
-              <w:right w:type="dxa" w:w="120"/>
-            </w:tcMar>
-          </w:tcPr>
-          <w:p>
-            <w:pPr>
-              <w:spacing w:line="276"/>
-            </w:pPr>
-            <w:r>
-              <w:rPr>
-                <w:rFonts w:ascii="Calibri" w:eastAsia="Microsoft YaHei"/>
-                <w:color w:val="182030"/>
-                <w:sz w:val="20"/>
-                <w:szCs w:val="20"/>
-              </w:rPr>
-              <w:t xml:space="preserve">Closing slide: Built by AI agents on Fastn + the Activity page traces behind it.</w:t>
-            </w:r>
-          </w:p>
-        </w:tc>
-        <w:tc>
-          <w:tcPr>
-            <w:tcW w:type="pct" w:w="54%"/>
-            <w:tcMar>
-              <w:top w:type="dxa" w:w="60"/>
-              <w:left w:type="dxa" w:w="120"/>
-              <w:bottom w:type="dxa" w:w="60"/>
-              <w:right w:type="dxa" w:w="120"/>
-            </w:tcMar>
-          </w:tcPr>
-          <w:p>
-            <w:pPr>
-              <w:spacing w:line="276"/>
-            </w:pPr>
-            <w:r>
-              <w:rPr>
-                <w:rFonts w:ascii="Calibri" w:eastAsia="Microsoft YaHei"/>
-                <w:color w:val="182030"/>
-                <w:sz w:val="20"/>
-                <w:szCs w:val="20"/>
-              </w:rPr>
-              <w:t xml:space="preserve">Every step ran on Fastn - the platform this is built on. And the backend was built by AI agents, through Fastn's tools. PulseGuard: keep your customers, before they leave.</w:t>
+            <w:r>
+              <w:t>Every step executed on Fastn governed runtime — and our backend was built by AI agents through Fastn MCP gateway. PulseGuard: from telemetry to retained customers, powered by Fastn.</w:t>
             </w:r>
           </w:p>
         </w:tc>
@@ -1149,15 +874,7 @@
         <w:spacing w:after="60" w:line="312"/>
       </w:pPr>
       <w:r>
-        <w:rPr>
-          <w:rFonts w:ascii="Calibri" w:eastAsia="Microsoft YaHei"/>
-          <w:b w:val="false"/>
-          <w:bCs w:val="false"/>
-          <w:color w:val="182030"/>
-          <w:sz w:val="22"/>
-          <w:szCs w:val="22"/>
-        </w:rPr>
-        <w:t xml:space="preserve">Reset demo history on the Activity page once, then do one warm-up run so rows are not empty.</w:t>
+        <w:t>Clear localStorage once, then do one warm-up run so rows are not empty.</w:t>
       </w:r>
     </w:p>
     <w:p>

</xml_diff>